<commit_message>
Docs: two-day study schedule, system before code
Section 0.4 lays out the first two days. It also states the reading
order explicitly, because that order matters: system (ch. 1-3), then
what each stage solves (ch. 4-10), and only then the code appendix.
Reading code before the system gives you a pile of disconnected
details; the other way round each line has somewhere to attach.

Day one is the system: read chapters 1-3, then trace one line of
G-code ("G1 X10 Y10 F3000") through every stage and fill in an empty
table saying what each stage receives, what it turns it into and which
units it works in. Day two reads chapters 4-10 for the problem each
stage solves, skipping their code, and runs the B.2 measurements, which
are about machine behaviour rather than code.

Co-Authored-By: Claude Opus 5 <noreply@anthropic.com>
</commit_message>
<xml_diff>
--- a/docs/CoreXY_firmware_tai_lieu_dao_tao.docx
+++ b/docs/CoreXY_firmware_tai_lieu_dao_tao.docx
@@ -2265,6 +2265,2078 @@
           <w:color w:val="1A1A1A"/>
         </w:rPr>
         <w:t xml:space="preserve"> vào một file văn bản. Mỗi buổi viết ba dòng: hôm nay dự đoán gì, đo được gì, vì sao lệch. Sau tám buổi, đọc lại chính nhật ký đó sẽ thấy rõ mình tiến tới đâu, và những chỗ từng hiểu sai thường là những chỗ nhớ kỹ nhất.</w:t>
+      </w:r>
+    </w:p>
+    <w:p>
+      <w:pPr>
+        <w:pStyle w:val="Heading2"/>
+        <w:spacing w:after="120" w:before="300"/>
+      </w:pPr>
+      <w:r>
+        <w:t xml:space="preserve">0.4 Lịch học hai ngày đầu</w:t>
+      </w:r>
+    </w:p>
+    <w:p>
+      <w:pPr>
+        <w:spacing w:after="130" w:line="310"/>
+        <w:jc w:val="both"/>
+      </w:pPr>
+      <w:r>
+        <w:rPr>
+          <w:color w:val="1A1A1A"/>
+        </w:rPr>
+        <w:t xml:space="preserve">Tài liệu có ba tầng, và thứ tự đọc quan trọng hơn người ta tưởng. Đọc code khi chưa nắm hệ thống thì chỉ thấy một đống chi tiết rời rạc; nắm hệ thống rồi thì đọc code nhanh hơn nhiều, vì mỗi dòng đã có chỗ để gắn vào.</w:t>
+      </w:r>
+    </w:p>
+    <w:tbl>
+      <w:tblPr>
+        <w:tblW w:type="dxa" w:w="9360"/>
+        <w:tblBorders>
+          <w:top w:val="single" w:color="auto" w:sz="4"/>
+          <w:left w:val="single" w:color="auto" w:sz="4"/>
+          <w:bottom w:val="single" w:color="auto" w:sz="4"/>
+          <w:right w:val="single" w:color="auto" w:sz="4"/>
+          <w:insideH w:val="single" w:color="auto" w:sz="4"/>
+          <w:insideV w:val="single" w:color="auto" w:sz="4"/>
+        </w:tblBorders>
+      </w:tblPr>
+      <w:tblGrid>
+        <w:gridCol w:w="1534"/>
+        <w:gridCol w:w="1995"/>
+        <w:gridCol w:w="3990"/>
+        <w:gridCol w:w="1841"/>
+      </w:tblGrid>
+      <w:tr>
+        <w:trPr>
+          <w:tblHeader/>
+        </w:trPr>
+        <w:tc>
+          <w:tcPr>
+            <w:tcW w:type="dxa" w:w="1534"/>
+            <w:shd w:fill="E4EDEC" w:val="clear"/>
+            <w:tcMar>
+              <w:top w:type="dxa" w:w="70"/>
+              <w:left w:type="dxa" w:w="110"/>
+              <w:bottom w:type="dxa" w:w="70"/>
+              <w:right w:type="dxa" w:w="110"/>
+            </w:tcMar>
+          </w:tcPr>
+          <w:p>
+            <w:pPr>
+              <w:spacing w:after="0" w:line="255"/>
+            </w:pPr>
+            <w:r>
+              <w:rPr>
+                <w:b/>
+                <w:bCs/>
+                <w:color w:val="1A1A1A"/>
+                <w:sz w:val="19"/>
+                <w:szCs w:val="19"/>
+              </w:rPr>
+              <w:t xml:space="preserve">Tầng</w:t>
+            </w:r>
+          </w:p>
+        </w:tc>
+        <w:tc>
+          <w:tcPr>
+            <w:tcW w:type="dxa" w:w="1995"/>
+            <w:shd w:fill="E4EDEC" w:val="clear"/>
+            <w:tcMar>
+              <w:top w:type="dxa" w:w="70"/>
+              <w:left w:type="dxa" w:w="110"/>
+              <w:bottom w:type="dxa" w:w="70"/>
+              <w:right w:type="dxa" w:w="110"/>
+            </w:tcMar>
+          </w:tcPr>
+          <w:p>
+            <w:pPr>
+              <w:spacing w:after="0" w:line="255"/>
+            </w:pPr>
+            <w:r>
+              <w:rPr>
+                <w:b/>
+                <w:bCs/>
+                <w:color w:val="1A1A1A"/>
+                <w:sz w:val="19"/>
+                <w:szCs w:val="19"/>
+              </w:rPr>
+              <w:t xml:space="preserve">Nằm ở đâu</w:t>
+            </w:r>
+          </w:p>
+        </w:tc>
+        <w:tc>
+          <w:tcPr>
+            <w:tcW w:type="dxa" w:w="3990"/>
+            <w:shd w:fill="E4EDEC" w:val="clear"/>
+            <w:tcMar>
+              <w:top w:type="dxa" w:w="70"/>
+              <w:left w:type="dxa" w:w="110"/>
+              <w:bottom w:type="dxa" w:w="70"/>
+              <w:right w:type="dxa" w:w="110"/>
+            </w:tcMar>
+          </w:tcPr>
+          <w:p>
+            <w:pPr>
+              <w:spacing w:after="0" w:line="255"/>
+            </w:pPr>
+            <w:r>
+              <w:rPr>
+                <w:b/>
+                <w:bCs/>
+                <w:color w:val="1A1A1A"/>
+                <w:sz w:val="19"/>
+                <w:szCs w:val="19"/>
+              </w:rPr>
+              <w:t xml:space="preserve">Trả lời câu hỏi</w:t>
+            </w:r>
+          </w:p>
+        </w:tc>
+        <w:tc>
+          <w:tcPr>
+            <w:tcW w:type="dxa" w:w="1841"/>
+            <w:shd w:fill="E4EDEC" w:val="clear"/>
+            <w:tcMar>
+              <w:top w:type="dxa" w:w="70"/>
+              <w:left w:type="dxa" w:w="110"/>
+              <w:bottom w:type="dxa" w:w="70"/>
+              <w:right w:type="dxa" w:w="110"/>
+            </w:tcMar>
+          </w:tcPr>
+          <w:p>
+            <w:pPr>
+              <w:spacing w:after="0" w:line="255"/>
+            </w:pPr>
+            <w:r>
+              <w:rPr>
+                <w:b/>
+                <w:bCs/>
+                <w:color w:val="1A1A1A"/>
+                <w:sz w:val="19"/>
+                <w:szCs w:val="19"/>
+              </w:rPr>
+              <w:t xml:space="preserve">Đọc khi nào</w:t>
+            </w:r>
+          </w:p>
+        </w:tc>
+      </w:tr>
+      <w:tr>
+        <w:tc>
+          <w:tcPr>
+            <w:tcW w:type="dxa" w:w="1534"/>
+            <w:tcMar>
+              <w:top w:type="dxa" w:w="70"/>
+              <w:left w:type="dxa" w:w="110"/>
+              <w:bottom w:type="dxa" w:w="70"/>
+              <w:right w:type="dxa" w:w="110"/>
+            </w:tcMar>
+          </w:tcPr>
+          <w:p>
+            <w:pPr>
+              <w:spacing w:after="0" w:line="255"/>
+            </w:pPr>
+            <w:r>
+              <w:rPr>
+                <w:b w:val="false"/>
+                <w:bCs w:val="false"/>
+                <w:color w:val="1A1A1A"/>
+                <w:sz w:val="19"/>
+                <w:szCs w:val="19"/>
+              </w:rPr>
+              <w:t xml:space="preserve">Hệ thống</w:t>
+            </w:r>
+          </w:p>
+        </w:tc>
+        <w:tc>
+          <w:tcPr>
+            <w:tcW w:type="dxa" w:w="1995"/>
+            <w:tcMar>
+              <w:top w:type="dxa" w:w="70"/>
+              <w:left w:type="dxa" w:w="110"/>
+              <w:bottom w:type="dxa" w:w="70"/>
+              <w:right w:type="dxa" w:w="110"/>
+            </w:tcMar>
+          </w:tcPr>
+          <w:p>
+            <w:pPr>
+              <w:spacing w:after="0" w:line="255"/>
+            </w:pPr>
+            <w:r>
+              <w:rPr>
+                <w:b w:val="false"/>
+                <w:bCs w:val="false"/>
+                <w:color w:val="1A1A1A"/>
+                <w:sz w:val="19"/>
+                <w:szCs w:val="19"/>
+              </w:rPr>
+              <w:t xml:space="preserve">Chương 1, 2, 3</w:t>
+            </w:r>
+          </w:p>
+        </w:tc>
+        <w:tc>
+          <w:tcPr>
+            <w:tcW w:type="dxa" w:w="3990"/>
+            <w:tcMar>
+              <w:top w:type="dxa" w:w="70"/>
+              <w:left w:type="dxa" w:w="110"/>
+              <w:bottom w:type="dxa" w:w="70"/>
+              <w:right w:type="dxa" w:w="110"/>
+            </w:tcMar>
+          </w:tcPr>
+          <w:p>
+            <w:pPr>
+              <w:spacing w:after="0" w:line="255"/>
+            </w:pPr>
+            <w:r>
+              <w:rPr>
+                <w:b w:val="false"/>
+                <w:bCs w:val="false"/>
+                <w:color w:val="1A1A1A"/>
+                <w:sz w:val="19"/>
+                <w:szCs w:val="19"/>
+              </w:rPr>
+              <w:t xml:space="preserve">Máy gồm những gì, ghép với nhau ra sao</w:t>
+            </w:r>
+          </w:p>
+        </w:tc>
+        <w:tc>
+          <w:tcPr>
+            <w:tcW w:type="dxa" w:w="1841"/>
+            <w:tcMar>
+              <w:top w:type="dxa" w:w="70"/>
+              <w:left w:type="dxa" w:w="110"/>
+              <w:bottom w:type="dxa" w:w="70"/>
+              <w:right w:type="dxa" w:w="110"/>
+            </w:tcMar>
+          </w:tcPr>
+          <w:p>
+            <w:pPr>
+              <w:spacing w:after="0" w:line="255"/>
+            </w:pPr>
+            <w:r>
+              <w:rPr>
+                <w:b w:val="false"/>
+                <w:bCs w:val="false"/>
+                <w:color w:val="1A1A1A"/>
+                <w:sz w:val="19"/>
+                <w:szCs w:val="19"/>
+              </w:rPr>
+              <w:t xml:space="preserve">trước tiên</w:t>
+            </w:r>
+          </w:p>
+        </w:tc>
+      </w:tr>
+      <w:tr>
+        <w:tc>
+          <w:tcPr>
+            <w:tcW w:type="dxa" w:w="1534"/>
+            <w:tcMar>
+              <w:top w:type="dxa" w:w="70"/>
+              <w:left w:type="dxa" w:w="110"/>
+              <w:bottom w:type="dxa" w:w="70"/>
+              <w:right w:type="dxa" w:w="110"/>
+            </w:tcMar>
+          </w:tcPr>
+          <w:p>
+            <w:pPr>
+              <w:spacing w:after="0" w:line="255"/>
+            </w:pPr>
+            <w:r>
+              <w:rPr>
+                <w:b w:val="false"/>
+                <w:bCs w:val="false"/>
+                <w:color w:val="1A1A1A"/>
+                <w:sz w:val="19"/>
+                <w:szCs w:val="19"/>
+              </w:rPr>
+              <w:t xml:space="preserve">Từng khâu</w:t>
+            </w:r>
+          </w:p>
+        </w:tc>
+        <w:tc>
+          <w:tcPr>
+            <w:tcW w:type="dxa" w:w="1995"/>
+            <w:tcMar>
+              <w:top w:type="dxa" w:w="70"/>
+              <w:left w:type="dxa" w:w="110"/>
+              <w:bottom w:type="dxa" w:w="70"/>
+              <w:right w:type="dxa" w:w="110"/>
+            </w:tcMar>
+          </w:tcPr>
+          <w:p>
+            <w:pPr>
+              <w:spacing w:after="0" w:line="255"/>
+            </w:pPr>
+            <w:r>
+              <w:rPr>
+                <w:b w:val="false"/>
+                <w:bCs w:val="false"/>
+                <w:color w:val="1A1A1A"/>
+                <w:sz w:val="19"/>
+                <w:szCs w:val="19"/>
+              </w:rPr>
+              <w:t xml:space="preserve">Chương 4 tới 10</w:t>
+            </w:r>
+          </w:p>
+        </w:tc>
+        <w:tc>
+          <w:tcPr>
+            <w:tcW w:type="dxa" w:w="3990"/>
+            <w:tcMar>
+              <w:top w:type="dxa" w:w="70"/>
+              <w:left w:type="dxa" w:w="110"/>
+              <w:bottom w:type="dxa" w:w="70"/>
+              <w:right w:type="dxa" w:w="110"/>
+            </w:tcMar>
+          </w:tcPr>
+          <w:p>
+            <w:pPr>
+              <w:spacing w:after="0" w:line="255"/>
+            </w:pPr>
+            <w:r>
+              <w:rPr>
+                <w:b w:val="false"/>
+                <w:bCs w:val="false"/>
+                <w:color w:val="1A1A1A"/>
+                <w:sz w:val="19"/>
+                <w:szCs w:val="19"/>
+              </w:rPr>
+              <w:t xml:space="preserve">Mỗi khâu giải quyết vấn đề gì, vì sao cần</w:t>
+            </w:r>
+          </w:p>
+        </w:tc>
+        <w:tc>
+          <w:tcPr>
+            <w:tcW w:type="dxa" w:w="1841"/>
+            <w:tcMar>
+              <w:top w:type="dxa" w:w="70"/>
+              <w:left w:type="dxa" w:w="110"/>
+              <w:bottom w:type="dxa" w:w="70"/>
+              <w:right w:type="dxa" w:w="110"/>
+            </w:tcMar>
+          </w:tcPr>
+          <w:p>
+            <w:pPr>
+              <w:spacing w:after="0" w:line="255"/>
+            </w:pPr>
+            <w:r>
+              <w:rPr>
+                <w:b w:val="false"/>
+                <w:bCs w:val="false"/>
+                <w:color w:val="1A1A1A"/>
+                <w:sz w:val="19"/>
+                <w:szCs w:val="19"/>
+              </w:rPr>
+              <w:t xml:space="preserve">ngay sau đó</w:t>
+            </w:r>
+          </w:p>
+        </w:tc>
+      </w:tr>
+      <w:tr>
+        <w:tc>
+          <w:tcPr>
+            <w:tcW w:type="dxa" w:w="1534"/>
+            <w:tcMar>
+              <w:top w:type="dxa" w:w="70"/>
+              <w:left w:type="dxa" w:w="110"/>
+              <w:bottom w:type="dxa" w:w="70"/>
+              <w:right w:type="dxa" w:w="110"/>
+            </w:tcMar>
+          </w:tcPr>
+          <w:p>
+            <w:pPr>
+              <w:spacing w:after="0" w:line="255"/>
+            </w:pPr>
+            <w:r>
+              <w:rPr>
+                <w:b w:val="false"/>
+                <w:bCs w:val="false"/>
+                <w:color w:val="1A1A1A"/>
+                <w:sz w:val="19"/>
+                <w:szCs w:val="19"/>
+              </w:rPr>
+              <w:t xml:space="preserve">Code</w:t>
+            </w:r>
+          </w:p>
+        </w:tc>
+        <w:tc>
+          <w:tcPr>
+            <w:tcW w:type="dxa" w:w="1995"/>
+            <w:tcMar>
+              <w:top w:type="dxa" w:w="70"/>
+              <w:left w:type="dxa" w:w="110"/>
+              <w:bottom w:type="dxa" w:w="70"/>
+              <w:right w:type="dxa" w:w="110"/>
+            </w:tcMar>
+          </w:tcPr>
+          <w:p>
+            <w:pPr>
+              <w:spacing w:after="0" w:line="255"/>
+            </w:pPr>
+            <w:r>
+              <w:rPr>
+                <w:b w:val="false"/>
+                <w:bCs w:val="false"/>
+                <w:color w:val="1A1A1A"/>
+                <w:sz w:val="19"/>
+                <w:szCs w:val="19"/>
+              </w:rPr>
+              <w:t xml:space="preserve">Phụ lục A</w:t>
+            </w:r>
+          </w:p>
+        </w:tc>
+        <w:tc>
+          <w:tcPr>
+            <w:tcW w:type="dxa" w:w="3990"/>
+            <w:tcMar>
+              <w:top w:type="dxa" w:w="70"/>
+              <w:left w:type="dxa" w:w="110"/>
+              <w:bottom w:type="dxa" w:w="70"/>
+              <w:right w:type="dxa" w:w="110"/>
+            </w:tcMar>
+          </w:tcPr>
+          <w:p>
+            <w:pPr>
+              <w:spacing w:after="0" w:line="255"/>
+            </w:pPr>
+            <w:r>
+              <w:rPr>
+                <w:b w:val="false"/>
+                <w:bCs w:val="false"/>
+                <w:color w:val="1A1A1A"/>
+                <w:sz w:val="19"/>
+                <w:szCs w:val="19"/>
+              </w:rPr>
+              <w:t xml:space="preserve">Dòng nào làm việc đó</w:t>
+            </w:r>
+          </w:p>
+        </w:tc>
+        <w:tc>
+          <w:tcPr>
+            <w:tcW w:type="dxa" w:w="1841"/>
+            <w:tcMar>
+              <w:top w:type="dxa" w:w="70"/>
+              <w:left w:type="dxa" w:w="110"/>
+              <w:bottom w:type="dxa" w:w="70"/>
+              <w:right w:type="dxa" w:w="110"/>
+            </w:tcMar>
+          </w:tcPr>
+          <w:p>
+            <w:pPr>
+              <w:spacing w:after="0" w:line="255"/>
+            </w:pPr>
+            <w:r>
+              <w:rPr>
+                <w:b w:val="false"/>
+                <w:bCs w:val="false"/>
+                <w:color w:val="1A1A1A"/>
+                <w:sz w:val="19"/>
+                <w:szCs w:val="19"/>
+              </w:rPr>
+              <w:t xml:space="preserve">khi bắt đầu sửa code</w:t>
+            </w:r>
+          </w:p>
+        </w:tc>
+      </w:tr>
+      <w:tr>
+        <w:tc>
+          <w:tcPr>
+            <w:tcW w:type="dxa" w:w="1534"/>
+            <w:tcMar>
+              <w:top w:type="dxa" w:w="70"/>
+              <w:left w:type="dxa" w:w="110"/>
+              <w:bottom w:type="dxa" w:w="70"/>
+              <w:right w:type="dxa" w:w="110"/>
+            </w:tcMar>
+          </w:tcPr>
+          <w:p>
+            <w:pPr>
+              <w:spacing w:after="0" w:line="255"/>
+            </w:pPr>
+            <w:r>
+              <w:rPr>
+                <w:b w:val="false"/>
+                <w:bCs w:val="false"/>
+                <w:color w:val="1A1A1A"/>
+                <w:sz w:val="19"/>
+                <w:szCs w:val="19"/>
+              </w:rPr>
+              <w:t xml:space="preserve">Phương pháp</w:t>
+            </w:r>
+          </w:p>
+        </w:tc>
+        <w:tc>
+          <w:tcPr>
+            <w:tcW w:type="dxa" w:w="1995"/>
+            <w:tcMar>
+              <w:top w:type="dxa" w:w="70"/>
+              <w:left w:type="dxa" w:w="110"/>
+              <w:bottom w:type="dxa" w:w="70"/>
+              <w:right w:type="dxa" w:w="110"/>
+            </w:tcMar>
+          </w:tcPr>
+          <w:p>
+            <w:pPr>
+              <w:spacing w:after="0" w:line="255"/>
+            </w:pPr>
+            <w:r>
+              <w:rPr>
+                <w:b w:val="false"/>
+                <w:bCs w:val="false"/>
+                <w:color w:val="1A1A1A"/>
+                <w:sz w:val="19"/>
+                <w:szCs w:val="19"/>
+              </w:rPr>
+              <w:t xml:space="preserve">Chương 11, 12</w:t>
+            </w:r>
+          </w:p>
+        </w:tc>
+        <w:tc>
+          <w:tcPr>
+            <w:tcW w:type="dxa" w:w="3990"/>
+            <w:tcMar>
+              <w:top w:type="dxa" w:w="70"/>
+              <w:left w:type="dxa" w:w="110"/>
+              <w:bottom w:type="dxa" w:w="70"/>
+              <w:right w:type="dxa" w:w="110"/>
+            </w:tcMar>
+          </w:tcPr>
+          <w:p>
+            <w:pPr>
+              <w:spacing w:after="0" w:line="255"/>
+            </w:pPr>
+            <w:r>
+              <w:rPr>
+                <w:b w:val="false"/>
+                <w:bCs w:val="false"/>
+                <w:color w:val="1A1A1A"/>
+                <w:sz w:val="19"/>
+                <w:szCs w:val="19"/>
+              </w:rPr>
+              <w:t xml:space="preserve">Làm việc và gỡ lỗi thế nào</w:t>
+            </w:r>
+          </w:p>
+        </w:tc>
+        <w:tc>
+          <w:tcPr>
+            <w:tcW w:type="dxa" w:w="1841"/>
+            <w:tcMar>
+              <w:top w:type="dxa" w:w="70"/>
+              <w:left w:type="dxa" w:w="110"/>
+              <w:bottom w:type="dxa" w:w="70"/>
+              <w:right w:type="dxa" w:w="110"/>
+            </w:tcMar>
+          </w:tcPr>
+          <w:p>
+            <w:pPr>
+              <w:spacing w:after="0" w:line="255"/>
+            </w:pPr>
+            <w:r>
+              <w:rPr>
+                <w:b w:val="false"/>
+                <w:bCs w:val="false"/>
+                <w:color w:val="1A1A1A"/>
+                <w:sz w:val="19"/>
+                <w:szCs w:val="19"/>
+              </w:rPr>
+              <w:t xml:space="preserve">khi gặp lỗi đầu tiên</w:t>
+            </w:r>
+          </w:p>
+        </w:tc>
+      </w:tr>
+    </w:tbl>
+    <w:p>
+      <w:pPr>
+        <w:spacing w:after="110"/>
+      </w:pPr>
+    </w:p>
+    <w:p>
+      <w:pPr>
+        <w:pStyle w:val="Heading3"/>
+        <w:spacing w:after="100" w:before="220"/>
+      </w:pPr>
+      <w:r>
+        <w:t xml:space="preserve">Ngày thứ nhất: hiểu hệ thống, khoảng 2 tiếng</w:t>
+      </w:r>
+    </w:p>
+    <w:tbl>
+      <w:tblPr>
+        <w:tblW w:type="dxa" w:w="9360"/>
+        <w:tblBorders>
+          <w:top w:val="single" w:color="auto" w:sz="4"/>
+          <w:left w:val="single" w:color="auto" w:sz="4"/>
+          <w:bottom w:val="single" w:color="auto" w:sz="4"/>
+          <w:right w:val="single" w:color="auto" w:sz="4"/>
+          <w:insideH w:val="single" w:color="auto" w:sz="4"/>
+          <w:insideV w:val="single" w:color="auto" w:sz="4"/>
+        </w:tblBorders>
+      </w:tblPr>
+      <w:tblGrid>
+        <w:gridCol w:w="936"/>
+        <w:gridCol w:w="1560"/>
+        <w:gridCol w:w="6864"/>
+      </w:tblGrid>
+      <w:tr>
+        <w:trPr>
+          <w:tblHeader/>
+        </w:trPr>
+        <w:tc>
+          <w:tcPr>
+            <w:tcW w:type="dxa" w:w="936"/>
+            <w:shd w:fill="E4EDEC" w:val="clear"/>
+            <w:tcMar>
+              <w:top w:type="dxa" w:w="70"/>
+              <w:left w:type="dxa" w:w="110"/>
+              <w:bottom w:type="dxa" w:w="70"/>
+              <w:right w:type="dxa" w:w="110"/>
+            </w:tcMar>
+          </w:tcPr>
+          <w:p>
+            <w:pPr>
+              <w:spacing w:after="0" w:line="255"/>
+            </w:pPr>
+            <w:r>
+              <w:rPr>
+                <w:b/>
+                <w:bCs/>
+                <w:color w:val="1A1A1A"/>
+                <w:sz w:val="19"/>
+                <w:szCs w:val="19"/>
+              </w:rPr>
+              <w:t xml:space="preserve">Buổi</w:t>
+            </w:r>
+          </w:p>
+        </w:tc>
+        <w:tc>
+          <w:tcPr>
+            <w:tcW w:type="dxa" w:w="1560"/>
+            <w:shd w:fill="E4EDEC" w:val="clear"/>
+            <w:tcMar>
+              <w:top w:type="dxa" w:w="70"/>
+              <w:left w:type="dxa" w:w="110"/>
+              <w:bottom w:type="dxa" w:w="70"/>
+              <w:right w:type="dxa" w:w="110"/>
+            </w:tcMar>
+          </w:tcPr>
+          <w:p>
+            <w:pPr>
+              <w:spacing w:after="0" w:line="255"/>
+            </w:pPr>
+            <w:r>
+              <w:rPr>
+                <w:b/>
+                <w:bCs/>
+                <w:color w:val="1A1A1A"/>
+                <w:sz w:val="19"/>
+                <w:szCs w:val="19"/>
+              </w:rPr>
+              <w:t xml:space="preserve">Thời lượng</w:t>
+            </w:r>
+          </w:p>
+        </w:tc>
+        <w:tc>
+          <w:tcPr>
+            <w:tcW w:type="dxa" w:w="6864"/>
+            <w:shd w:fill="E4EDEC" w:val="clear"/>
+            <w:tcMar>
+              <w:top w:type="dxa" w:w="70"/>
+              <w:left w:type="dxa" w:w="110"/>
+              <w:bottom w:type="dxa" w:w="70"/>
+              <w:right w:type="dxa" w:w="110"/>
+            </w:tcMar>
+          </w:tcPr>
+          <w:p>
+            <w:pPr>
+              <w:spacing w:after="0" w:line="255"/>
+            </w:pPr>
+            <w:r>
+              <w:rPr>
+                <w:b/>
+                <w:bCs/>
+                <w:color w:val="1A1A1A"/>
+                <w:sz w:val="19"/>
+                <w:szCs w:val="19"/>
+              </w:rPr>
+              <w:t xml:space="preserve">Việc</w:t>
+            </w:r>
+          </w:p>
+        </w:tc>
+      </w:tr>
+      <w:tr>
+        <w:tc>
+          <w:tcPr>
+            <w:tcW w:type="dxa" w:w="936"/>
+            <w:tcMar>
+              <w:top w:type="dxa" w:w="70"/>
+              <w:left w:type="dxa" w:w="110"/>
+              <w:bottom w:type="dxa" w:w="70"/>
+              <w:right w:type="dxa" w:w="110"/>
+            </w:tcMar>
+          </w:tcPr>
+          <w:p>
+            <w:pPr>
+              <w:spacing w:after="0" w:line="255"/>
+            </w:pPr>
+            <w:r>
+              <w:rPr>
+                <w:rFonts w:ascii="Consolas" w:cs="Consolas" w:eastAsia="Consolas" w:hAnsi="Consolas"/>
+                <w:b w:val="false"/>
+                <w:bCs w:val="false"/>
+                <w:color w:val="1A1A1A"/>
+                <w:sz w:val="19"/>
+                <w:szCs w:val="19"/>
+              </w:rPr>
+              <w:t xml:space="preserve">1</w:t>
+            </w:r>
+          </w:p>
+        </w:tc>
+        <w:tc>
+          <w:tcPr>
+            <w:tcW w:type="dxa" w:w="1560"/>
+            <w:tcMar>
+              <w:top w:type="dxa" w:w="70"/>
+              <w:left w:type="dxa" w:w="110"/>
+              <w:bottom w:type="dxa" w:w="70"/>
+              <w:right w:type="dxa" w:w="110"/>
+            </w:tcMar>
+          </w:tcPr>
+          <w:p>
+            <w:pPr>
+              <w:spacing w:after="0" w:line="255"/>
+            </w:pPr>
+            <w:r>
+              <w:rPr>
+                <w:b w:val="false"/>
+                <w:bCs w:val="false"/>
+                <w:color w:val="1A1A1A"/>
+                <w:sz w:val="19"/>
+                <w:szCs w:val="19"/>
+              </w:rPr>
+              <w:t xml:space="preserve">60 phút</w:t>
+            </w:r>
+          </w:p>
+        </w:tc>
+        <w:tc>
+          <w:tcPr>
+            <w:tcW w:type="dxa" w:w="6864"/>
+            <w:tcMar>
+              <w:top w:type="dxa" w:w="70"/>
+              <w:left w:type="dxa" w:w="110"/>
+              <w:bottom w:type="dxa" w:w="70"/>
+              <w:right w:type="dxa" w:w="110"/>
+            </w:tcMar>
+          </w:tcPr>
+          <w:p>
+            <w:pPr>
+              <w:spacing w:after="0" w:line="255"/>
+            </w:pPr>
+            <w:r>
+              <w:rPr>
+                <w:b w:val="false"/>
+                <w:bCs w:val="false"/>
+                <w:color w:val="1A1A1A"/>
+                <w:sz w:val="19"/>
+                <w:szCs w:val="19"/>
+              </w:rPr>
+              <w:t xml:space="preserve">Đọc chương 1, 2, 3. Chương 3 có sơ đồ phân lớp, là bức tranh tổng thể</w:t>
+            </w:r>
+          </w:p>
+        </w:tc>
+      </w:tr>
+      <w:tr>
+        <w:tc>
+          <w:tcPr>
+            <w:tcW w:type="dxa" w:w="936"/>
+            <w:tcMar>
+              <w:top w:type="dxa" w:w="70"/>
+              <w:left w:type="dxa" w:w="110"/>
+              <w:bottom w:type="dxa" w:w="70"/>
+              <w:right w:type="dxa" w:w="110"/>
+            </w:tcMar>
+          </w:tcPr>
+          <w:p>
+            <w:pPr>
+              <w:spacing w:after="0" w:line="255"/>
+            </w:pPr>
+            <w:r>
+              <w:rPr>
+                <w:rFonts w:ascii="Consolas" w:cs="Consolas" w:eastAsia="Consolas" w:hAnsi="Consolas"/>
+                <w:b w:val="false"/>
+                <w:bCs w:val="false"/>
+                <w:color w:val="1A1A1A"/>
+                <w:sz w:val="19"/>
+                <w:szCs w:val="19"/>
+              </w:rPr>
+              <w:t xml:space="preserve">2</w:t>
+            </w:r>
+          </w:p>
+        </w:tc>
+        <w:tc>
+          <w:tcPr>
+            <w:tcW w:type="dxa" w:w="1560"/>
+            <w:tcMar>
+              <w:top w:type="dxa" w:w="70"/>
+              <w:left w:type="dxa" w:w="110"/>
+              <w:bottom w:type="dxa" w:w="70"/>
+              <w:right w:type="dxa" w:w="110"/>
+            </w:tcMar>
+          </w:tcPr>
+          <w:p>
+            <w:pPr>
+              <w:spacing w:after="0" w:line="255"/>
+            </w:pPr>
+            <w:r>
+              <w:rPr>
+                <w:b w:val="false"/>
+                <w:bCs w:val="false"/>
+                <w:color w:val="1A1A1A"/>
+                <w:sz w:val="19"/>
+                <w:szCs w:val="19"/>
+              </w:rPr>
+              <w:t xml:space="preserve">40 phút</w:t>
+            </w:r>
+          </w:p>
+        </w:tc>
+        <w:tc>
+          <w:tcPr>
+            <w:tcW w:type="dxa" w:w="6864"/>
+            <w:tcMar>
+              <w:top w:type="dxa" w:w="70"/>
+              <w:left w:type="dxa" w:w="110"/>
+              <w:bottom w:type="dxa" w:w="70"/>
+              <w:right w:type="dxa" w:w="110"/>
+            </w:tcMar>
+          </w:tcPr>
+          <w:p>
+            <w:pPr>
+              <w:spacing w:after="0" w:line="255"/>
+            </w:pPr>
+            <w:r>
+              <w:rPr>
+                <w:b w:val="false"/>
+                <w:bCs w:val="false"/>
+                <w:color w:val="1A1A1A"/>
+                <w:sz w:val="19"/>
+                <w:szCs w:val="19"/>
+              </w:rPr>
+              <w:t xml:space="preserve">Làm bài tập lần theo một dòng lệnh, bảng ngay bên dưới</w:t>
+            </w:r>
+          </w:p>
+        </w:tc>
+      </w:tr>
+      <w:tr>
+        <w:tc>
+          <w:tcPr>
+            <w:tcW w:type="dxa" w:w="936"/>
+            <w:tcMar>
+              <w:top w:type="dxa" w:w="70"/>
+              <w:left w:type="dxa" w:w="110"/>
+              <w:bottom w:type="dxa" w:w="70"/>
+              <w:right w:type="dxa" w:w="110"/>
+            </w:tcMar>
+          </w:tcPr>
+          <w:p>
+            <w:pPr>
+              <w:spacing w:after="0" w:line="255"/>
+            </w:pPr>
+            <w:r>
+              <w:rPr>
+                <w:rFonts w:ascii="Consolas" w:cs="Consolas" w:eastAsia="Consolas" w:hAnsi="Consolas"/>
+                <w:b w:val="false"/>
+                <w:bCs w:val="false"/>
+                <w:color w:val="1A1A1A"/>
+                <w:sz w:val="19"/>
+                <w:szCs w:val="19"/>
+              </w:rPr>
+              <w:t xml:space="preserve">3</w:t>
+            </w:r>
+          </w:p>
+        </w:tc>
+        <w:tc>
+          <w:tcPr>
+            <w:tcW w:type="dxa" w:w="1560"/>
+            <w:tcMar>
+              <w:top w:type="dxa" w:w="70"/>
+              <w:left w:type="dxa" w:w="110"/>
+              <w:bottom w:type="dxa" w:w="70"/>
+              <w:right w:type="dxa" w:w="110"/>
+            </w:tcMar>
+          </w:tcPr>
+          <w:p>
+            <w:pPr>
+              <w:spacing w:after="0" w:line="255"/>
+            </w:pPr>
+            <w:r>
+              <w:rPr>
+                <w:b w:val="false"/>
+                <w:bCs w:val="false"/>
+                <w:color w:val="1A1A1A"/>
+                <w:sz w:val="19"/>
+                <w:szCs w:val="19"/>
+              </w:rPr>
+              <w:t xml:space="preserve">20 phút</w:t>
+            </w:r>
+          </w:p>
+        </w:tc>
+        <w:tc>
+          <w:tcPr>
+            <w:tcW w:type="dxa" w:w="6864"/>
+            <w:tcMar>
+              <w:top w:type="dxa" w:w="70"/>
+              <w:left w:type="dxa" w:w="110"/>
+              <w:bottom w:type="dxa" w:w="70"/>
+              <w:right w:type="dxa" w:w="110"/>
+            </w:tcMar>
+          </w:tcPr>
+          <w:p>
+            <w:pPr>
+              <w:spacing w:after="0" w:line="255"/>
+            </w:pPr>
+            <w:r>
+              <w:rPr>
+                <w:b w:val="false"/>
+                <w:bCs w:val="false"/>
+                <w:color w:val="1A1A1A"/>
+                <w:sz w:val="19"/>
+                <w:szCs w:val="19"/>
+              </w:rPr>
+              <w:t xml:space="preserve">Vẽ lại sơ đồ phân lớp từ trí nhớ, chỉ ra ranh giới đổi đơn vị nằm ở đâu và vì sao ở đó</w:t>
+            </w:r>
+          </w:p>
+        </w:tc>
+      </w:tr>
+    </w:tbl>
+    <w:p>
+      <w:pPr>
+        <w:spacing w:after="110"/>
+      </w:pPr>
+    </w:p>
+    <w:p>
+      <w:pPr>
+        <w:pStyle w:val="Heading3"/>
+        <w:spacing w:after="100" w:before="220"/>
+      </w:pPr>
+      <w:r>
+        <w:t xml:space="preserve">Bài tập buổi 2: lần theo một dòng lệnh</w:t>
+      </w:r>
+    </w:p>
+    <w:p>
+      <w:pPr>
+        <w:spacing w:after="130" w:line="310"/>
+        <w:jc w:val="both"/>
+      </w:pPr>
+      <w:r>
+        <w:rPr>
+          <w:color w:val="1A1A1A"/>
+        </w:rPr>
+        <w:t xml:space="preserve">Lấy đúng một dòng G-code và tự điền bảng dưới, </w:t>
+      </w:r>
+      <w:r>
+        <w:rPr>
+          <w:b/>
+          <w:bCs/>
+          <w:color w:val="1A1A1A"/>
+        </w:rPr>
+        <w:t xml:space="preserve">không nhìn tài liệu</w:t>
+      </w:r>
+      <w:r>
+        <w:rPr>
+          <w:color w:val="1A1A1A"/>
+        </w:rPr>
+        <w:t xml:space="preserve">. Điền được hết nghĩa là đã hiểu hệ thống.</w:t>
+      </w:r>
+    </w:p>
+    <w:p>
+      <w:pPr>
+        <w:shd w:fill="F2F4F2" w:val="clear"/>
+        <w:spacing w:after="150" w:before="110" w:line="240"/>
+        <w:ind w:left="200" w:right="200"/>
+      </w:pPr>
+      <w:r>
+        <w:rPr>
+          <w:rFonts w:ascii="Consolas" w:cs="Consolas" w:eastAsia="Consolas" w:hAnsi="Consolas"/>
+          <w:color w:val="173A3D"/>
+          <w:sz w:val="17"/>
+          <w:szCs w:val="17"/>
+        </w:rPr>
+        <w:t xml:space="preserve">G1 X10 Y10 F3000</w:t>
+      </w:r>
+    </w:p>
+    <w:tbl>
+      <w:tblPr>
+        <w:tblW w:type="dxa" w:w="9360"/>
+        <w:tblBorders>
+          <w:top w:val="single" w:color="auto" w:sz="4"/>
+          <w:left w:val="single" w:color="auto" w:sz="4"/>
+          <w:bottom w:val="single" w:color="auto" w:sz="4"/>
+          <w:right w:val="single" w:color="auto" w:sz="4"/>
+          <w:insideH w:val="single" w:color="auto" w:sz="4"/>
+          <w:insideV w:val="single" w:color="auto" w:sz="4"/>
+        </w:tblBorders>
+      </w:tblPr>
+      <w:tblGrid>
+        <w:gridCol w:w="2184"/>
+        <w:gridCol w:w="2652"/>
+        <w:gridCol w:w="2652"/>
+        <w:gridCol w:w="1872"/>
+      </w:tblGrid>
+      <w:tr>
+        <w:trPr>
+          <w:tblHeader/>
+        </w:trPr>
+        <w:tc>
+          <w:tcPr>
+            <w:tcW w:type="dxa" w:w="2184"/>
+            <w:shd w:fill="E4EDEC" w:val="clear"/>
+            <w:tcMar>
+              <w:top w:type="dxa" w:w="70"/>
+              <w:left w:type="dxa" w:w="110"/>
+              <w:bottom w:type="dxa" w:w="70"/>
+              <w:right w:type="dxa" w:w="110"/>
+            </w:tcMar>
+          </w:tcPr>
+          <w:p>
+            <w:pPr>
+              <w:spacing w:after="0" w:line="255"/>
+            </w:pPr>
+            <w:r>
+              <w:rPr>
+                <w:b/>
+                <w:bCs/>
+                <w:color w:val="1A1A1A"/>
+                <w:sz w:val="19"/>
+                <w:szCs w:val="19"/>
+              </w:rPr>
+              <w:t xml:space="preserve">Khâu</w:t>
+            </w:r>
+          </w:p>
+        </w:tc>
+        <w:tc>
+          <w:tcPr>
+            <w:tcW w:type="dxa" w:w="2652"/>
+            <w:shd w:fill="E4EDEC" w:val="clear"/>
+            <w:tcMar>
+              <w:top w:type="dxa" w:w="70"/>
+              <w:left w:type="dxa" w:w="110"/>
+              <w:bottom w:type="dxa" w:w="70"/>
+              <w:right w:type="dxa" w:w="110"/>
+            </w:tcMar>
+          </w:tcPr>
+          <w:p>
+            <w:pPr>
+              <w:spacing w:after="0" w:line="255"/>
+            </w:pPr>
+            <w:r>
+              <w:rPr>
+                <w:b/>
+                <w:bCs/>
+                <w:color w:val="1A1A1A"/>
+                <w:sz w:val="19"/>
+                <w:szCs w:val="19"/>
+              </w:rPr>
+              <w:t xml:space="preserve">Nhận vào cái gì</w:t>
+            </w:r>
+          </w:p>
+        </w:tc>
+        <w:tc>
+          <w:tcPr>
+            <w:tcW w:type="dxa" w:w="2652"/>
+            <w:shd w:fill="E4EDEC" w:val="clear"/>
+            <w:tcMar>
+              <w:top w:type="dxa" w:w="70"/>
+              <w:left w:type="dxa" w:w="110"/>
+              <w:bottom w:type="dxa" w:w="70"/>
+              <w:right w:type="dxa" w:w="110"/>
+            </w:tcMar>
+          </w:tcPr>
+          <w:p>
+            <w:pPr>
+              <w:spacing w:after="0" w:line="255"/>
+            </w:pPr>
+            <w:r>
+              <w:rPr>
+                <w:b/>
+                <w:bCs/>
+                <w:color w:val="1A1A1A"/>
+                <w:sz w:val="19"/>
+                <w:szCs w:val="19"/>
+              </w:rPr>
+              <w:t xml:space="preserve">Biến thành cái gì</w:t>
+            </w:r>
+          </w:p>
+        </w:tc>
+        <w:tc>
+          <w:tcPr>
+            <w:tcW w:type="dxa" w:w="1872"/>
+            <w:shd w:fill="E4EDEC" w:val="clear"/>
+            <w:tcMar>
+              <w:top w:type="dxa" w:w="70"/>
+              <w:left w:type="dxa" w:w="110"/>
+              <w:bottom w:type="dxa" w:w="70"/>
+              <w:right w:type="dxa" w:w="110"/>
+            </w:tcMar>
+          </w:tcPr>
+          <w:p>
+            <w:pPr>
+              <w:spacing w:after="0" w:line="255"/>
+            </w:pPr>
+            <w:r>
+              <w:rPr>
+                <w:b/>
+                <w:bCs/>
+                <w:color w:val="1A1A1A"/>
+                <w:sz w:val="19"/>
+                <w:szCs w:val="19"/>
+              </w:rPr>
+              <w:t xml:space="preserve">Đơn vị làm việc</w:t>
+            </w:r>
+          </w:p>
+        </w:tc>
+      </w:tr>
+      <w:tr>
+        <w:tc>
+          <w:tcPr>
+            <w:tcW w:type="dxa" w:w="2184"/>
+            <w:tcMar>
+              <w:top w:type="dxa" w:w="70"/>
+              <w:left w:type="dxa" w:w="110"/>
+              <w:bottom w:type="dxa" w:w="70"/>
+              <w:right w:type="dxa" w:w="110"/>
+            </w:tcMar>
+          </w:tcPr>
+          <w:p>
+            <w:pPr>
+              <w:spacing w:after="0" w:line="255"/>
+            </w:pPr>
+            <w:r>
+              <w:rPr>
+                <w:b w:val="false"/>
+                <w:bCs w:val="false"/>
+                <w:color w:val="1A1A1A"/>
+                <w:sz w:val="19"/>
+                <w:szCs w:val="19"/>
+              </w:rPr>
+              <w:t xml:space="preserve">gcode.c</w:t>
+            </w:r>
+          </w:p>
+        </w:tc>
+        <w:tc>
+          <w:tcPr>
+            <w:tcW w:type="dxa" w:w="2652"/>
+            <w:tcMar>
+              <w:top w:type="dxa" w:w="70"/>
+              <w:left w:type="dxa" w:w="110"/>
+              <w:bottom w:type="dxa" w:w="70"/>
+              <w:right w:type="dxa" w:w="110"/>
+            </w:tcMar>
+          </w:tcPr>
+          <w:p>
+            <w:pPr>
+              <w:spacing w:after="0" w:line="255"/>
+            </w:pPr>
+            <w:r>
+              <w:rPr>
+                <w:b w:val="false"/>
+                <w:bCs w:val="false"/>
+                <w:color w:val="1A1A1A"/>
+                <w:sz w:val="19"/>
+                <w:szCs w:val="19"/>
+              </w:rPr>
+              <w:t xml:space="preserve"/>
+            </w:r>
+          </w:p>
+        </w:tc>
+        <w:tc>
+          <w:tcPr>
+            <w:tcW w:type="dxa" w:w="2652"/>
+            <w:tcMar>
+              <w:top w:type="dxa" w:w="70"/>
+              <w:left w:type="dxa" w:w="110"/>
+              <w:bottom w:type="dxa" w:w="70"/>
+              <w:right w:type="dxa" w:w="110"/>
+            </w:tcMar>
+          </w:tcPr>
+          <w:p>
+            <w:pPr>
+              <w:spacing w:after="0" w:line="255"/>
+            </w:pPr>
+            <w:r>
+              <w:rPr>
+                <w:b w:val="false"/>
+                <w:bCs w:val="false"/>
+                <w:color w:val="1A1A1A"/>
+                <w:sz w:val="19"/>
+                <w:szCs w:val="19"/>
+              </w:rPr>
+              <w:t xml:space="preserve"/>
+            </w:r>
+          </w:p>
+        </w:tc>
+        <w:tc>
+          <w:tcPr>
+            <w:tcW w:type="dxa" w:w="1872"/>
+            <w:tcMar>
+              <w:top w:type="dxa" w:w="70"/>
+              <w:left w:type="dxa" w:w="110"/>
+              <w:bottom w:type="dxa" w:w="70"/>
+              <w:right w:type="dxa" w:w="110"/>
+            </w:tcMar>
+          </w:tcPr>
+          <w:p>
+            <w:pPr>
+              <w:spacing w:after="0" w:line="255"/>
+            </w:pPr>
+            <w:r>
+              <w:rPr>
+                <w:b w:val="false"/>
+                <w:bCs w:val="false"/>
+                <w:color w:val="1A1A1A"/>
+                <w:sz w:val="19"/>
+                <w:szCs w:val="19"/>
+              </w:rPr>
+              <w:t xml:space="preserve"/>
+            </w:r>
+          </w:p>
+        </w:tc>
+      </w:tr>
+      <w:tr>
+        <w:tc>
+          <w:tcPr>
+            <w:tcW w:type="dxa" w:w="2184"/>
+            <w:tcMar>
+              <w:top w:type="dxa" w:w="70"/>
+              <w:left w:type="dxa" w:w="110"/>
+              <w:bottom w:type="dxa" w:w="70"/>
+              <w:right w:type="dxa" w:w="110"/>
+            </w:tcMar>
+          </w:tcPr>
+          <w:p>
+            <w:pPr>
+              <w:spacing w:after="0" w:line="255"/>
+            </w:pPr>
+            <w:r>
+              <w:rPr>
+                <w:b w:val="false"/>
+                <w:bCs w:val="false"/>
+                <w:color w:val="1A1A1A"/>
+                <w:sz w:val="19"/>
+                <w:szCs w:val="19"/>
+              </w:rPr>
+              <w:t xml:space="preserve">motion_control.c</w:t>
+            </w:r>
+          </w:p>
+        </w:tc>
+        <w:tc>
+          <w:tcPr>
+            <w:tcW w:type="dxa" w:w="2652"/>
+            <w:tcMar>
+              <w:top w:type="dxa" w:w="70"/>
+              <w:left w:type="dxa" w:w="110"/>
+              <w:bottom w:type="dxa" w:w="70"/>
+              <w:right w:type="dxa" w:w="110"/>
+            </w:tcMar>
+          </w:tcPr>
+          <w:p>
+            <w:pPr>
+              <w:spacing w:after="0" w:line="255"/>
+            </w:pPr>
+            <w:r>
+              <w:rPr>
+                <w:b w:val="false"/>
+                <w:bCs w:val="false"/>
+                <w:color w:val="1A1A1A"/>
+                <w:sz w:val="19"/>
+                <w:szCs w:val="19"/>
+              </w:rPr>
+              <w:t xml:space="preserve"/>
+            </w:r>
+          </w:p>
+        </w:tc>
+        <w:tc>
+          <w:tcPr>
+            <w:tcW w:type="dxa" w:w="2652"/>
+            <w:tcMar>
+              <w:top w:type="dxa" w:w="70"/>
+              <w:left w:type="dxa" w:w="110"/>
+              <w:bottom w:type="dxa" w:w="70"/>
+              <w:right w:type="dxa" w:w="110"/>
+            </w:tcMar>
+          </w:tcPr>
+          <w:p>
+            <w:pPr>
+              <w:spacing w:after="0" w:line="255"/>
+            </w:pPr>
+            <w:r>
+              <w:rPr>
+                <w:b w:val="false"/>
+                <w:bCs w:val="false"/>
+                <w:color w:val="1A1A1A"/>
+                <w:sz w:val="19"/>
+                <w:szCs w:val="19"/>
+              </w:rPr>
+              <w:t xml:space="preserve"/>
+            </w:r>
+          </w:p>
+        </w:tc>
+        <w:tc>
+          <w:tcPr>
+            <w:tcW w:type="dxa" w:w="1872"/>
+            <w:tcMar>
+              <w:top w:type="dxa" w:w="70"/>
+              <w:left w:type="dxa" w:w="110"/>
+              <w:bottom w:type="dxa" w:w="70"/>
+              <w:right w:type="dxa" w:w="110"/>
+            </w:tcMar>
+          </w:tcPr>
+          <w:p>
+            <w:pPr>
+              <w:spacing w:after="0" w:line="255"/>
+            </w:pPr>
+            <w:r>
+              <w:rPr>
+                <w:b w:val="false"/>
+                <w:bCs w:val="false"/>
+                <w:color w:val="1A1A1A"/>
+                <w:sz w:val="19"/>
+                <w:szCs w:val="19"/>
+              </w:rPr>
+              <w:t xml:space="preserve"/>
+            </w:r>
+          </w:p>
+        </w:tc>
+      </w:tr>
+      <w:tr>
+        <w:tc>
+          <w:tcPr>
+            <w:tcW w:type="dxa" w:w="2184"/>
+            <w:tcMar>
+              <w:top w:type="dxa" w:w="70"/>
+              <w:left w:type="dxa" w:w="110"/>
+              <w:bottom w:type="dxa" w:w="70"/>
+              <w:right w:type="dxa" w:w="110"/>
+            </w:tcMar>
+          </w:tcPr>
+          <w:p>
+            <w:pPr>
+              <w:spacing w:after="0" w:line="255"/>
+            </w:pPr>
+            <w:r>
+              <w:rPr>
+                <w:b w:val="false"/>
+                <w:bCs w:val="false"/>
+                <w:color w:val="1A1A1A"/>
+                <w:sz w:val="19"/>
+                <w:szCs w:val="19"/>
+              </w:rPr>
+              <w:t xml:space="preserve">planner</w:t>
+            </w:r>
+          </w:p>
+        </w:tc>
+        <w:tc>
+          <w:tcPr>
+            <w:tcW w:type="dxa" w:w="2652"/>
+            <w:tcMar>
+              <w:top w:type="dxa" w:w="70"/>
+              <w:left w:type="dxa" w:w="110"/>
+              <w:bottom w:type="dxa" w:w="70"/>
+              <w:right w:type="dxa" w:w="110"/>
+            </w:tcMar>
+          </w:tcPr>
+          <w:p>
+            <w:pPr>
+              <w:spacing w:after="0" w:line="255"/>
+            </w:pPr>
+            <w:r>
+              <w:rPr>
+                <w:b w:val="false"/>
+                <w:bCs w:val="false"/>
+                <w:color w:val="1A1A1A"/>
+                <w:sz w:val="19"/>
+                <w:szCs w:val="19"/>
+              </w:rPr>
+              <w:t xml:space="preserve"/>
+            </w:r>
+          </w:p>
+        </w:tc>
+        <w:tc>
+          <w:tcPr>
+            <w:tcW w:type="dxa" w:w="2652"/>
+            <w:tcMar>
+              <w:top w:type="dxa" w:w="70"/>
+              <w:left w:type="dxa" w:w="110"/>
+              <w:bottom w:type="dxa" w:w="70"/>
+              <w:right w:type="dxa" w:w="110"/>
+            </w:tcMar>
+          </w:tcPr>
+          <w:p>
+            <w:pPr>
+              <w:spacing w:after="0" w:line="255"/>
+            </w:pPr>
+            <w:r>
+              <w:rPr>
+                <w:b w:val="false"/>
+                <w:bCs w:val="false"/>
+                <w:color w:val="1A1A1A"/>
+                <w:sz w:val="19"/>
+                <w:szCs w:val="19"/>
+              </w:rPr>
+              <w:t xml:space="preserve"/>
+            </w:r>
+          </w:p>
+        </w:tc>
+        <w:tc>
+          <w:tcPr>
+            <w:tcW w:type="dxa" w:w="1872"/>
+            <w:tcMar>
+              <w:top w:type="dxa" w:w="70"/>
+              <w:left w:type="dxa" w:w="110"/>
+              <w:bottom w:type="dxa" w:w="70"/>
+              <w:right w:type="dxa" w:w="110"/>
+            </w:tcMar>
+          </w:tcPr>
+          <w:p>
+            <w:pPr>
+              <w:spacing w:after="0" w:line="255"/>
+            </w:pPr>
+            <w:r>
+              <w:rPr>
+                <w:b w:val="false"/>
+                <w:bCs w:val="false"/>
+                <w:color w:val="1A1A1A"/>
+                <w:sz w:val="19"/>
+                <w:szCs w:val="19"/>
+              </w:rPr>
+              <w:t xml:space="preserve"/>
+            </w:r>
+          </w:p>
+        </w:tc>
+      </w:tr>
+      <w:tr>
+        <w:tc>
+          <w:tcPr>
+            <w:tcW w:type="dxa" w:w="2184"/>
+            <w:tcMar>
+              <w:top w:type="dxa" w:w="70"/>
+              <w:left w:type="dxa" w:w="110"/>
+              <w:bottom w:type="dxa" w:w="70"/>
+              <w:right w:type="dxa" w:w="110"/>
+            </w:tcMar>
+          </w:tcPr>
+          <w:p>
+            <w:pPr>
+              <w:spacing w:after="0" w:line="255"/>
+            </w:pPr>
+            <w:r>
+              <w:rPr>
+                <w:b w:val="false"/>
+                <w:bCs w:val="false"/>
+                <w:color w:val="1A1A1A"/>
+                <w:sz w:val="19"/>
+                <w:szCs w:val="19"/>
+              </w:rPr>
+              <w:t xml:space="preserve">ISR</w:t>
+            </w:r>
+          </w:p>
+        </w:tc>
+        <w:tc>
+          <w:tcPr>
+            <w:tcW w:type="dxa" w:w="2652"/>
+            <w:tcMar>
+              <w:top w:type="dxa" w:w="70"/>
+              <w:left w:type="dxa" w:w="110"/>
+              <w:bottom w:type="dxa" w:w="70"/>
+              <w:right w:type="dxa" w:w="110"/>
+            </w:tcMar>
+          </w:tcPr>
+          <w:p>
+            <w:pPr>
+              <w:spacing w:after="0" w:line="255"/>
+            </w:pPr>
+            <w:r>
+              <w:rPr>
+                <w:b w:val="false"/>
+                <w:bCs w:val="false"/>
+                <w:color w:val="1A1A1A"/>
+                <w:sz w:val="19"/>
+                <w:szCs w:val="19"/>
+              </w:rPr>
+              <w:t xml:space="preserve"/>
+            </w:r>
+          </w:p>
+        </w:tc>
+        <w:tc>
+          <w:tcPr>
+            <w:tcW w:type="dxa" w:w="2652"/>
+            <w:tcMar>
+              <w:top w:type="dxa" w:w="70"/>
+              <w:left w:type="dxa" w:w="110"/>
+              <w:bottom w:type="dxa" w:w="70"/>
+              <w:right w:type="dxa" w:w="110"/>
+            </w:tcMar>
+          </w:tcPr>
+          <w:p>
+            <w:pPr>
+              <w:spacing w:after="0" w:line="255"/>
+            </w:pPr>
+            <w:r>
+              <w:rPr>
+                <w:b w:val="false"/>
+                <w:bCs w:val="false"/>
+                <w:color w:val="1A1A1A"/>
+                <w:sz w:val="19"/>
+                <w:szCs w:val="19"/>
+              </w:rPr>
+              <w:t xml:space="preserve"/>
+            </w:r>
+          </w:p>
+        </w:tc>
+        <w:tc>
+          <w:tcPr>
+            <w:tcW w:type="dxa" w:w="1872"/>
+            <w:tcMar>
+              <w:top w:type="dxa" w:w="70"/>
+              <w:left w:type="dxa" w:w="110"/>
+              <w:bottom w:type="dxa" w:w="70"/>
+              <w:right w:type="dxa" w:w="110"/>
+            </w:tcMar>
+          </w:tcPr>
+          <w:p>
+            <w:pPr>
+              <w:spacing w:after="0" w:line="255"/>
+            </w:pPr>
+            <w:r>
+              <w:rPr>
+                <w:b w:val="false"/>
+                <w:bCs w:val="false"/>
+                <w:color w:val="1A1A1A"/>
+                <w:sz w:val="19"/>
+                <w:szCs w:val="19"/>
+              </w:rPr>
+              <w:t xml:space="preserve"/>
+            </w:r>
+          </w:p>
+        </w:tc>
+      </w:tr>
+      <w:tr>
+        <w:tc>
+          <w:tcPr>
+            <w:tcW w:type="dxa" w:w="2184"/>
+            <w:tcMar>
+              <w:top w:type="dxa" w:w="70"/>
+              <w:left w:type="dxa" w:w="110"/>
+              <w:bottom w:type="dxa" w:w="70"/>
+              <w:right w:type="dxa" w:w="110"/>
+            </w:tcMar>
+          </w:tcPr>
+          <w:p>
+            <w:pPr>
+              <w:spacing w:after="0" w:line="255"/>
+            </w:pPr>
+            <w:r>
+              <w:rPr>
+                <w:b w:val="false"/>
+                <w:bCs w:val="false"/>
+                <w:color w:val="1A1A1A"/>
+                <w:sz w:val="19"/>
+                <w:szCs w:val="19"/>
+              </w:rPr>
+              <w:t xml:space="preserve">driver TMC2209</w:t>
+            </w:r>
+          </w:p>
+        </w:tc>
+        <w:tc>
+          <w:tcPr>
+            <w:tcW w:type="dxa" w:w="2652"/>
+            <w:tcMar>
+              <w:top w:type="dxa" w:w="70"/>
+              <w:left w:type="dxa" w:w="110"/>
+              <w:bottom w:type="dxa" w:w="70"/>
+              <w:right w:type="dxa" w:w="110"/>
+            </w:tcMar>
+          </w:tcPr>
+          <w:p>
+            <w:pPr>
+              <w:spacing w:after="0" w:line="255"/>
+            </w:pPr>
+            <w:r>
+              <w:rPr>
+                <w:b w:val="false"/>
+                <w:bCs w:val="false"/>
+                <w:color w:val="1A1A1A"/>
+                <w:sz w:val="19"/>
+                <w:szCs w:val="19"/>
+              </w:rPr>
+              <w:t xml:space="preserve"/>
+            </w:r>
+          </w:p>
+        </w:tc>
+        <w:tc>
+          <w:tcPr>
+            <w:tcW w:type="dxa" w:w="2652"/>
+            <w:tcMar>
+              <w:top w:type="dxa" w:w="70"/>
+              <w:left w:type="dxa" w:w="110"/>
+              <w:bottom w:type="dxa" w:w="70"/>
+              <w:right w:type="dxa" w:w="110"/>
+            </w:tcMar>
+          </w:tcPr>
+          <w:p>
+            <w:pPr>
+              <w:spacing w:after="0" w:line="255"/>
+            </w:pPr>
+            <w:r>
+              <w:rPr>
+                <w:b w:val="false"/>
+                <w:bCs w:val="false"/>
+                <w:color w:val="1A1A1A"/>
+                <w:sz w:val="19"/>
+                <w:szCs w:val="19"/>
+              </w:rPr>
+              <w:t xml:space="preserve">xung điện cho hai cuộn dây</w:t>
+            </w:r>
+          </w:p>
+        </w:tc>
+        <w:tc>
+          <w:tcPr>
+            <w:tcW w:type="dxa" w:w="1872"/>
+            <w:tcMar>
+              <w:top w:type="dxa" w:w="70"/>
+              <w:left w:type="dxa" w:w="110"/>
+              <w:bottom w:type="dxa" w:w="70"/>
+              <w:right w:type="dxa" w:w="110"/>
+            </w:tcMar>
+          </w:tcPr>
+          <w:p>
+            <w:pPr>
+              <w:spacing w:after="0" w:line="255"/>
+            </w:pPr>
+            <w:r>
+              <w:rPr>
+                <w:b w:val="false"/>
+                <w:bCs w:val="false"/>
+                <w:color w:val="1A1A1A"/>
+                <w:sz w:val="19"/>
+                <w:szCs w:val="19"/>
+              </w:rPr>
+              <w:t xml:space="preserve">ampe</w:t>
+            </w:r>
+          </w:p>
+        </w:tc>
+      </w:tr>
+    </w:tbl>
+    <w:p>
+      <w:pPr>
+        <w:spacing w:after="110"/>
+      </w:pPr>
+    </w:p>
+    <w:p>
+      <w:pPr>
+        <w:pStyle w:val="Heading3"/>
+        <w:spacing w:after="100" w:before="220"/>
+      </w:pPr>
+      <w:r>
+        <w:t xml:space="preserve">Ngày thứ hai: hiểu từng khâu, khoảng 2 tiếng</w:t>
+      </w:r>
+    </w:p>
+    <w:tbl>
+      <w:tblPr>
+        <w:tblW w:type="dxa" w:w="9360"/>
+        <w:tblBorders>
+          <w:top w:val="single" w:color="auto" w:sz="4"/>
+          <w:left w:val="single" w:color="auto" w:sz="4"/>
+          <w:bottom w:val="single" w:color="auto" w:sz="4"/>
+          <w:right w:val="single" w:color="auto" w:sz="4"/>
+          <w:insideH w:val="single" w:color="auto" w:sz="4"/>
+          <w:insideV w:val="single" w:color="auto" w:sz="4"/>
+        </w:tblBorders>
+      </w:tblPr>
+      <w:tblGrid>
+        <w:gridCol w:w="936"/>
+        <w:gridCol w:w="1560"/>
+        <w:gridCol w:w="6864"/>
+      </w:tblGrid>
+      <w:tr>
+        <w:trPr>
+          <w:tblHeader/>
+        </w:trPr>
+        <w:tc>
+          <w:tcPr>
+            <w:tcW w:type="dxa" w:w="936"/>
+            <w:shd w:fill="E4EDEC" w:val="clear"/>
+            <w:tcMar>
+              <w:top w:type="dxa" w:w="70"/>
+              <w:left w:type="dxa" w:w="110"/>
+              <w:bottom w:type="dxa" w:w="70"/>
+              <w:right w:type="dxa" w:w="110"/>
+            </w:tcMar>
+          </w:tcPr>
+          <w:p>
+            <w:pPr>
+              <w:spacing w:after="0" w:line="255"/>
+            </w:pPr>
+            <w:r>
+              <w:rPr>
+                <w:b/>
+                <w:bCs/>
+                <w:color w:val="1A1A1A"/>
+                <w:sz w:val="19"/>
+                <w:szCs w:val="19"/>
+              </w:rPr>
+              <w:t xml:space="preserve">Buổi</w:t>
+            </w:r>
+          </w:p>
+        </w:tc>
+        <w:tc>
+          <w:tcPr>
+            <w:tcW w:type="dxa" w:w="1560"/>
+            <w:shd w:fill="E4EDEC" w:val="clear"/>
+            <w:tcMar>
+              <w:top w:type="dxa" w:w="70"/>
+              <w:left w:type="dxa" w:w="110"/>
+              <w:bottom w:type="dxa" w:w="70"/>
+              <w:right w:type="dxa" w:w="110"/>
+            </w:tcMar>
+          </w:tcPr>
+          <w:p>
+            <w:pPr>
+              <w:spacing w:after="0" w:line="255"/>
+            </w:pPr>
+            <w:r>
+              <w:rPr>
+                <w:b/>
+                <w:bCs/>
+                <w:color w:val="1A1A1A"/>
+                <w:sz w:val="19"/>
+                <w:szCs w:val="19"/>
+              </w:rPr>
+              <w:t xml:space="preserve">Thời lượng</w:t>
+            </w:r>
+          </w:p>
+        </w:tc>
+        <w:tc>
+          <w:tcPr>
+            <w:tcW w:type="dxa" w:w="6864"/>
+            <w:shd w:fill="E4EDEC" w:val="clear"/>
+            <w:tcMar>
+              <w:top w:type="dxa" w:w="70"/>
+              <w:left w:type="dxa" w:w="110"/>
+              <w:bottom w:type="dxa" w:w="70"/>
+              <w:right w:type="dxa" w:w="110"/>
+            </w:tcMar>
+          </w:tcPr>
+          <w:p>
+            <w:pPr>
+              <w:spacing w:after="0" w:line="255"/>
+            </w:pPr>
+            <w:r>
+              <w:rPr>
+                <w:b/>
+                <w:bCs/>
+                <w:color w:val="1A1A1A"/>
+                <w:sz w:val="19"/>
+                <w:szCs w:val="19"/>
+              </w:rPr>
+              <w:t xml:space="preserve">Việc</w:t>
+            </w:r>
+          </w:p>
+        </w:tc>
+      </w:tr>
+      <w:tr>
+        <w:tc>
+          <w:tcPr>
+            <w:tcW w:type="dxa" w:w="936"/>
+            <w:tcMar>
+              <w:top w:type="dxa" w:w="70"/>
+              <w:left w:type="dxa" w:w="110"/>
+              <w:bottom w:type="dxa" w:w="70"/>
+              <w:right w:type="dxa" w:w="110"/>
+            </w:tcMar>
+          </w:tcPr>
+          <w:p>
+            <w:pPr>
+              <w:spacing w:after="0" w:line="255"/>
+            </w:pPr>
+            <w:r>
+              <w:rPr>
+                <w:rFonts w:ascii="Consolas" w:cs="Consolas" w:eastAsia="Consolas" w:hAnsi="Consolas"/>
+                <w:b w:val="false"/>
+                <w:bCs w:val="false"/>
+                <w:color w:val="1A1A1A"/>
+                <w:sz w:val="19"/>
+                <w:szCs w:val="19"/>
+              </w:rPr>
+              <w:t xml:space="preserve">1</w:t>
+            </w:r>
+          </w:p>
+        </w:tc>
+        <w:tc>
+          <w:tcPr>
+            <w:tcW w:type="dxa" w:w="1560"/>
+            <w:tcMar>
+              <w:top w:type="dxa" w:w="70"/>
+              <w:left w:type="dxa" w:w="110"/>
+              <w:bottom w:type="dxa" w:w="70"/>
+              <w:right w:type="dxa" w:w="110"/>
+            </w:tcMar>
+          </w:tcPr>
+          <w:p>
+            <w:pPr>
+              <w:spacing w:after="0" w:line="255"/>
+            </w:pPr>
+            <w:r>
+              <w:rPr>
+                <w:b w:val="false"/>
+                <w:bCs w:val="false"/>
+                <w:color w:val="1A1A1A"/>
+                <w:sz w:val="19"/>
+                <w:szCs w:val="19"/>
+              </w:rPr>
+              <w:t xml:space="preserve">70 phút</w:t>
+            </w:r>
+          </w:p>
+        </w:tc>
+        <w:tc>
+          <w:tcPr>
+            <w:tcW w:type="dxa" w:w="6864"/>
+            <w:tcMar>
+              <w:top w:type="dxa" w:w="70"/>
+              <w:left w:type="dxa" w:w="110"/>
+              <w:bottom w:type="dxa" w:w="70"/>
+              <w:right w:type="dxa" w:w="110"/>
+            </w:tcMar>
+          </w:tcPr>
+          <w:p>
+            <w:pPr>
+              <w:spacing w:after="0" w:line="255"/>
+            </w:pPr>
+            <w:r>
+              <w:rPr>
+                <w:b w:val="false"/>
+                <w:bCs w:val="false"/>
+                <w:color w:val="1A1A1A"/>
+                <w:sz w:val="19"/>
+                <w:szCs w:val="19"/>
+              </w:rPr>
+              <w:t xml:space="preserve">Đọc nhanh chương 4 tới 10. Mỗi chương chỉ cần nắm ba điều: vấn đề gì, giải bằng cách nào, kết quả đo ra sao. **Bỏ qua mọi đoạn code** trong các chương này</w:t>
+            </w:r>
+          </w:p>
+        </w:tc>
+      </w:tr>
+      <w:tr>
+        <w:tc>
+          <w:tcPr>
+            <w:tcW w:type="dxa" w:w="936"/>
+            <w:tcMar>
+              <w:top w:type="dxa" w:w="70"/>
+              <w:left w:type="dxa" w:w="110"/>
+              <w:bottom w:type="dxa" w:w="70"/>
+              <w:right w:type="dxa" w:w="110"/>
+            </w:tcMar>
+          </w:tcPr>
+          <w:p>
+            <w:pPr>
+              <w:spacing w:after="0" w:line="255"/>
+            </w:pPr>
+            <w:r>
+              <w:rPr>
+                <w:rFonts w:ascii="Consolas" w:cs="Consolas" w:eastAsia="Consolas" w:hAnsi="Consolas"/>
+                <w:b w:val="false"/>
+                <w:bCs w:val="false"/>
+                <w:color w:val="1A1A1A"/>
+                <w:sz w:val="19"/>
+                <w:szCs w:val="19"/>
+              </w:rPr>
+              <w:t xml:space="preserve">2</w:t>
+            </w:r>
+          </w:p>
+        </w:tc>
+        <w:tc>
+          <w:tcPr>
+            <w:tcW w:type="dxa" w:w="1560"/>
+            <w:tcMar>
+              <w:top w:type="dxa" w:w="70"/>
+              <w:left w:type="dxa" w:w="110"/>
+              <w:bottom w:type="dxa" w:w="70"/>
+              <w:right w:type="dxa" w:w="110"/>
+            </w:tcMar>
+          </w:tcPr>
+          <w:p>
+            <w:pPr>
+              <w:spacing w:after="0" w:line="255"/>
+            </w:pPr>
+            <w:r>
+              <w:rPr>
+                <w:b w:val="false"/>
+                <w:bCs w:val="false"/>
+                <w:color w:val="1A1A1A"/>
+                <w:sz w:val="19"/>
+                <w:szCs w:val="19"/>
+              </w:rPr>
+              <w:t xml:space="preserve">40 phút</w:t>
+            </w:r>
+          </w:p>
+        </w:tc>
+        <w:tc>
+          <w:tcPr>
+            <w:tcW w:type="dxa" w:w="6864"/>
+            <w:tcMar>
+              <w:top w:type="dxa" w:w="70"/>
+              <w:left w:type="dxa" w:w="110"/>
+              <w:bottom w:type="dxa" w:w="70"/>
+              <w:right w:type="dxa" w:w="110"/>
+            </w:tcMar>
+          </w:tcPr>
+          <w:p>
+            <w:pPr>
+              <w:spacing w:after="0" w:line="255"/>
+            </w:pPr>
+            <w:r>
+              <w:rPr>
+                <w:b w:val="false"/>
+                <w:bCs w:val="false"/>
+                <w:color w:val="1A1A1A"/>
+                <w:sz w:val="19"/>
+                <w:szCs w:val="19"/>
+              </w:rPr>
+              <w:t xml:space="preserve">Làm bài tập B.2. Đây là bài tập về hành vi của hệ thống, không phải về code: chạy lệnh, đọc số, so với dự đoán</w:t>
+            </w:r>
+          </w:p>
+        </w:tc>
+      </w:tr>
+      <w:tr>
+        <w:tc>
+          <w:tcPr>
+            <w:tcW w:type="dxa" w:w="936"/>
+            <w:tcMar>
+              <w:top w:type="dxa" w:w="70"/>
+              <w:left w:type="dxa" w:w="110"/>
+              <w:bottom w:type="dxa" w:w="70"/>
+              <w:right w:type="dxa" w:w="110"/>
+            </w:tcMar>
+          </w:tcPr>
+          <w:p>
+            <w:pPr>
+              <w:spacing w:after="0" w:line="255"/>
+            </w:pPr>
+            <w:r>
+              <w:rPr>
+                <w:rFonts w:ascii="Consolas" w:cs="Consolas" w:eastAsia="Consolas" w:hAnsi="Consolas"/>
+                <w:b w:val="false"/>
+                <w:bCs w:val="false"/>
+                <w:color w:val="1A1A1A"/>
+                <w:sz w:val="19"/>
+                <w:szCs w:val="19"/>
+              </w:rPr>
+              <w:t xml:space="preserve">3</w:t>
+            </w:r>
+          </w:p>
+        </w:tc>
+        <w:tc>
+          <w:tcPr>
+            <w:tcW w:type="dxa" w:w="1560"/>
+            <w:tcMar>
+              <w:top w:type="dxa" w:w="70"/>
+              <w:left w:type="dxa" w:w="110"/>
+              <w:bottom w:type="dxa" w:w="70"/>
+              <w:right w:type="dxa" w:w="110"/>
+            </w:tcMar>
+          </w:tcPr>
+          <w:p>
+            <w:pPr>
+              <w:spacing w:after="0" w:line="255"/>
+            </w:pPr>
+            <w:r>
+              <w:rPr>
+                <w:b w:val="false"/>
+                <w:bCs w:val="false"/>
+                <w:color w:val="1A1A1A"/>
+                <w:sz w:val="19"/>
+                <w:szCs w:val="19"/>
+              </w:rPr>
+              <w:t xml:space="preserve">10 phút</w:t>
+            </w:r>
+          </w:p>
+        </w:tc>
+        <w:tc>
+          <w:tcPr>
+            <w:tcW w:type="dxa" w:w="6864"/>
+            <w:tcMar>
+              <w:top w:type="dxa" w:w="70"/>
+              <w:left w:type="dxa" w:w="110"/>
+              <w:bottom w:type="dxa" w:w="70"/>
+              <w:right w:type="dxa" w:w="110"/>
+            </w:tcMar>
+          </w:tcPr>
+          <w:p>
+            <w:pPr>
+              <w:spacing w:after="0" w:line="255"/>
+            </w:pPr>
+            <w:r>
+              <w:rPr>
+                <w:b w:val="false"/>
+                <w:bCs w:val="false"/>
+                <w:color w:val="1A1A1A"/>
+                <w:sz w:val="19"/>
+                <w:szCs w:val="19"/>
+              </w:rPr>
+              <w:t xml:space="preserve">Ghi nhật ký ba dòng</w:t>
+            </w:r>
+          </w:p>
+        </w:tc>
+      </w:tr>
+    </w:tbl>
+    <w:p>
+      <w:pPr>
+        <w:spacing w:after="110"/>
+      </w:pPr>
+    </w:p>
+    <w:p>
+      <w:pPr>
+        <w:pBdr>
+          <w:left w:val="single" w:color="D99A00" w:sz="18" w:space="8"/>
+        </w:pBdr>
+        <w:shd w:fill="FFF6E0" w:val="clear"/>
+        <w:spacing w:after="170" w:before="130" w:line="300"/>
+        <w:ind w:left="200" w:right="200"/>
+        <w:jc w:val="both"/>
+      </w:pPr>
+      <w:r>
+        <w:rPr>
+          <w:b/>
+          <w:bCs/>
+          <w:color w:val="D99A00"/>
+        </w:rPr>
+        <w:t xml:space="preserve">Chưa cần đọc phụ lục A trong hai ngày này. </w:t>
+      </w:r>
+      <w:r>
+        <w:rPr>
+          <w:color w:val="1A1A1A"/>
+        </w:rPr>
+        <w:t xml:space="preserve">Để dành tới lúc bắt tay sửa code, và khi đó cũng chỉ mở đúng hai mục liên quan tới thứ đang làm.</w:t>
+      </w:r>
+    </w:p>
+    <w:p>
+      <w:pPr>
+        <w:pBdr>
+          <w:left w:val="single" w:color="0B5E63" w:sz="18" w:space="8"/>
+        </w:pBdr>
+        <w:shd w:fill="EAF1F0" w:val="clear"/>
+        <w:spacing w:after="170" w:before="130" w:line="300"/>
+        <w:ind w:left="200" w:right="200"/>
+        <w:jc w:val="both"/>
+      </w:pPr>
+      <w:r>
+        <w:rPr>
+          <w:b/>
+          <w:bCs/>
+          <w:color w:val="0B5E63"/>
+        </w:rPr>
+        <w:t xml:space="preserve">Nếu thiếu thời gian: </w:t>
+      </w:r>
+      <w:r>
+        <w:rPr>
+          <w:color w:val="1A1A1A"/>
+        </w:rPr>
+        <w:t xml:space="preserve">bỏ theo thứ tự nhật ký, rồi buổi 3 của ngày thứ nhất. Không bỏ buổi đọc chương 1, 2, 3 và buổi làm B.2, vì hai buổi đó là nền cho mọi thứ sau.</w:t>
       </w:r>
     </w:p>
     <w:p>

</xml_diff>